<commit_message>
Novas fotos dos cards 1 ano
</commit_message>
<xml_diff>
--- a/rotinas/DocumentacaoSite.docx
+++ b/rotinas/DocumentacaoSite.docx
@@ -1299,7 +1299,7 @@
               </w:rPr>
               <w:t>Prompts</w:t>
               <w:tab/>
-              <w:t>28</w:t>
+              <w:t>29</w:t>
             </w:r>
           </w:hyperlink>
           <w:r>
@@ -2115,31 +2115,7 @@
                 <w:rFonts w:ascii="Google Sans Text;sans-serif" w:hAnsi="Google Sans Text;sans-serif"/>
                 <w:b/>
               </w:rPr>
-              <w:t>duvid</w:t>
-            </w:r>
-            <w:r>
-              <w:rPr>
-                <w:rStyle w:val="Cdigo-fonte"/>
-                <w:rFonts w:ascii="Google Sans Text;sans-serif" w:hAnsi="Google Sans Text;sans-serif"/>
-                <w:b/>
-              </w:rPr>
-              <w:t>_</w:t>
-            </w:r>
-            <w:r>
-              <w:rPr>
-                <w:rStyle w:val="Cdigo-fonte"/>
-                <w:rFonts w:ascii="Google Sans Text;sans-serif" w:hAnsi="Google Sans Text;sans-serif"/>
-                <w:b/>
-              </w:rPr>
-              <w:t>api</w:t>
-            </w:r>
-            <w:r>
-              <w:rPr>
-                <w:rStyle w:val="Cdigo-fonte"/>
-                <w:rFonts w:ascii="Google Sans Text;sans-serif" w:hAnsi="Google Sans Text;sans-serif"/>
-                <w:b/>
-              </w:rPr>
-              <w:t>.php</w:t>
+              <w:t>duvid_api.php</w:t>
             </w:r>
           </w:p>
         </w:tc>
@@ -12963,7 +12939,187 @@
           <w:spacing w:val="0"/>
           <w:sz w:val="24"/>
         </w:rPr>
-        <w:t>Redesenhe o ícone em anexo em pixel art nítido, de alta resolução (640x430 px) com um fundo contextual. O estilo deve ser 'pixel art polido' (polished pixel art), com cores ricas e sombras definidas (sem borrão) para criar volume e profundidade. O objeto deve ser claramente reconhecível, com detalhes aprimorados em relação a versões simples. Fundo transparente.</w:t>
+        <w:t xml:space="preserve">Redesenhe o ícone em anexo em pixel art nítido, de alta resolução (640x430 px) com um fundo contextual. O estilo deve ser 'pixel art polido' (polished pixel art), com cores ricas e sombras definidas (sem borrão) para criar volume e profundidade. O objeto deve ser claramente reconhecível, com detalhes aprimorados em relação a versões simples. </w:t>
+      </w:r>
+      <w:r>
+        <w:rPr>
+          <w:rFonts w:ascii="Google Sans Flex;Google Sans;Helvetica Neue;sans-serif" w:hAnsi="Google Sans Flex;Google Sans;Helvetica Neue;sans-serif"/>
+          <w:b w:val="false"/>
+          <w:i w:val="false"/>
+          <w:caps w:val="false"/>
+          <w:smallCaps w:val="false"/>
+          <w:color w:val="000000"/>
+          <w:spacing w:val="0"/>
+          <w:sz w:val="24"/>
+        </w:rPr>
+        <w:t>Preencha todo o espaço da imagem.</w:t>
+      </w:r>
+    </w:p>
+    <w:p>
+      <w:pPr>
+        <w:pStyle w:val="Normal"/>
+        <w:jc w:val="both"/>
+        <w:rPr>
+          <w:rFonts w:ascii="Google Sans Flex;Google Sans;Helvetica Neue;sans-serif" w:hAnsi="Google Sans Flex;Google Sans;Helvetica Neue;sans-serif"/>
+          <w:b w:val="false"/>
+          <w:i w:val="false"/>
+          <w:caps w:val="false"/>
+          <w:smallCaps w:val="false"/>
+          <w:color w:val="000000"/>
+          <w:spacing w:val="0"/>
+          <w:sz w:val="24"/>
+        </w:rPr>
+      </w:pPr>
+      <w:r>
+        <w:rPr>
+          <w:rFonts w:ascii="Google Sans Flex;Google Sans;Helvetica Neue;sans-serif" w:hAnsi="Google Sans Flex;Google Sans;Helvetica Neue;sans-serif"/>
+          <w:b w:val="false"/>
+          <w:i w:val="false"/>
+          <w:caps w:val="false"/>
+          <w:smallCaps w:val="false"/>
+          <w:color w:val="000000"/>
+          <w:spacing w:val="0"/>
+          <w:sz w:val="24"/>
+        </w:rPr>
+      </w:r>
+    </w:p>
+    <w:p>
+      <w:pPr>
+        <w:pStyle w:val="Normal"/>
+        <w:jc w:val="both"/>
+        <w:rPr/>
+      </w:pPr>
+      <w:r>
+        <w:rPr>
+          <w:rFonts w:ascii="Google Sans Flex;Google Sans;Helvetica Neue;sans-serif" w:hAnsi="Google Sans Flex;Google Sans;Helvetica Neue;sans-serif"/>
+          <w:b w:val="false"/>
+          <w:i w:val="false"/>
+          <w:caps w:val="false"/>
+          <w:smallCaps w:val="false"/>
+          <w:color w:val="000000"/>
+          <w:spacing w:val="0"/>
+          <w:sz w:val="24"/>
+        </w:rPr>
+        <w:t>Faça uma imagem</w:t>
+      </w:r>
+      <w:r>
+        <w:rPr>
+          <w:rFonts w:ascii="Google Sans Flex;Google Sans;Helvetica Neue;sans-serif" w:hAnsi="Google Sans Flex;Google Sans;Helvetica Neue;sans-serif"/>
+          <w:b w:val="false"/>
+          <w:i w:val="false"/>
+          <w:caps w:val="false"/>
+          <w:smallCaps w:val="false"/>
+          <w:color w:val="000000"/>
+          <w:spacing w:val="0"/>
+          <w:sz w:val="24"/>
+        </w:rPr>
+        <w:t xml:space="preserve"> em pixel art nítido, de alta resolução (640x430 px) com um fundo contextual. O estilo deve ser 'pixel art polido' (polished pixel art), com cores ricas e sombras definidas (sem borrão) para criar volume e profundidade. O objeto deve ser claramente reconhecível, com detalhes aprimorados em relação a versões simples.</w:t>
+      </w:r>
+      <w:r>
+        <w:rPr>
+          <w:rFonts w:ascii="Google Sans Flex;Google Sans;Helvetica Neue;sans-serif" w:hAnsi="Google Sans Flex;Google Sans;Helvetica Neue;sans-serif"/>
+          <w:b w:val="false"/>
+          <w:i w:val="false"/>
+          <w:caps w:val="false"/>
+          <w:smallCaps w:val="false"/>
+          <w:color w:val="000000"/>
+          <w:spacing w:val="0"/>
+          <w:sz w:val="24"/>
+        </w:rPr>
+        <w:t xml:space="preserve"> </w:t>
+      </w:r>
+      <w:r>
+        <w:rPr>
+          <w:rFonts w:ascii="Google Sans Flex;Google Sans;Helvetica Neue;sans-serif" w:hAnsi="Google Sans Flex;Google Sans;Helvetica Neue;sans-serif"/>
+          <w:b w:val="false"/>
+          <w:i w:val="false"/>
+          <w:caps w:val="false"/>
+          <w:smallCaps w:val="false"/>
+          <w:color w:val="000000"/>
+          <w:spacing w:val="0"/>
+          <w:sz w:val="24"/>
+        </w:rPr>
+        <w:t xml:space="preserve">Preencha todo o espaço da imagem. </w:t>
+      </w:r>
+      <w:r>
+        <w:rPr>
+          <w:rFonts w:ascii="Google Sans Flex;Google Sans;Helvetica Neue;sans-serif" w:hAnsi="Google Sans Flex;Google Sans;Helvetica Neue;sans-serif"/>
+          <w:b w:val="false"/>
+          <w:i w:val="false"/>
+          <w:caps w:val="false"/>
+          <w:smallCaps w:val="false"/>
+          <w:color w:val="000000"/>
+          <w:spacing w:val="0"/>
+          <w:sz w:val="24"/>
+        </w:rPr>
+        <w:t xml:space="preserve">Não precisa inserir textos na imagem. </w:t>
+      </w:r>
+      <w:r>
+        <w:rPr>
+          <w:rFonts w:ascii="Google Sans Flex;Google Sans;Helvetica Neue;sans-serif" w:hAnsi="Google Sans Flex;Google Sans;Helvetica Neue;sans-serif"/>
+          <w:b w:val="false"/>
+          <w:i w:val="false"/>
+          <w:caps w:val="false"/>
+          <w:smallCaps w:val="false"/>
+          <w:color w:val="000000"/>
+          <w:spacing w:val="0"/>
+          <w:sz w:val="24"/>
+        </w:rPr>
+        <w:t xml:space="preserve">Deve aparecer </w:t>
+      </w:r>
+      <w:r>
+        <w:rPr>
+          <w:rFonts w:ascii="Google Sans Flex;Google Sans;Helvetica Neue;sans-serif" w:hAnsi="Google Sans Flex;Google Sans;Helvetica Neue;sans-serif"/>
+          <w:b w:val="false"/>
+          <w:i w:val="false"/>
+          <w:caps w:val="false"/>
+          <w:smallCaps w:val="false"/>
+          <w:color w:val="000000"/>
+          <w:spacing w:val="0"/>
+          <w:sz w:val="24"/>
+        </w:rPr>
+        <w:t>esses</w:t>
+      </w:r>
+      <w:r>
+        <w:rPr>
+          <w:rFonts w:ascii="Google Sans Flex;Google Sans;Helvetica Neue;sans-serif" w:hAnsi="Google Sans Flex;Google Sans;Helvetica Neue;sans-serif"/>
+          <w:b w:val="false"/>
+          <w:i w:val="false"/>
+          <w:caps w:val="false"/>
+          <w:smallCaps w:val="false"/>
+          <w:color w:val="000000"/>
+          <w:spacing w:val="0"/>
+          <w:sz w:val="24"/>
+        </w:rPr>
+        <w:t xml:space="preserve"> temas em uma bela composição: </w:t>
+      </w:r>
+    </w:p>
+    <w:p>
+      <w:pPr>
+        <w:pStyle w:val="Normal"/>
+        <w:jc w:val="both"/>
+        <w:rPr>
+          <w:rFonts w:ascii="Google Sans Flex;Google Sans;Helvetica Neue;sans-serif" w:hAnsi="Google Sans Flex;Google Sans;Helvetica Neue;sans-serif"/>
+          <w:b w:val="false"/>
+          <w:i w:val="false"/>
+          <w:caps w:val="false"/>
+          <w:smallCaps w:val="false"/>
+          <w:color w:val="000000"/>
+          <w:spacing w:val="0"/>
+          <w:sz w:val="24"/>
+        </w:rPr>
+      </w:pPr>
+      <w:r>
+        <w:rPr>
+          <w:rFonts w:ascii="Google Sans Flex;Google Sans;Helvetica Neue;sans-serif" w:hAnsi="Google Sans Flex;Google Sans;Helvetica Neue;sans-serif"/>
+          <w:b w:val="false"/>
+          <w:i w:val="false"/>
+          <w:caps w:val="false"/>
+          <w:smallCaps w:val="false"/>
+          <w:color w:val="000000"/>
+          <w:spacing w:val="0"/>
+          <w:sz w:val="24"/>
+        </w:rPr>
       </w:r>
     </w:p>
     <w:p>
@@ -13085,7 +13241,7 @@
         <w:rPr>
           <w:color w:val="000000"/>
         </w:rPr>
-        <w:t>Elementos: Ícones 2D limpos, pequenos mapas, gráficos simplificados e personagens minimalistas (estilo flat design) interagindo com o conteúdo.</w:t>
+        <w:t>Elementos: Ícones limpos, pequenos mapas, gráficos simplificados e personagens minimalistas (estilo flat design) interagindo com o conteúdo.</w:t>
       </w:r>
     </w:p>
     <w:p>

</xml_diff>